<commit_message>
Add the OSM cross-check to the video script (honesty/close beat)
The close already turned "no live speeds" into "fusion-ready"; now it also
lands the independent validation: built blind to any road map, the score
still rediscovers the city's commercial cores. Updated both the standalone
VIDEO_SCRIPT.md (+ regenerated docx) and the embedded script in
SUBMISSION.md; nudged the runtime target to ~2:55.

Co-Authored-By: Claude Opus 4.8 <noreply@anthropic.com>
Claude-Session: https://claude.ai/code/session_015xqbLKu3bgv91jhV9ZLyyM
</commit_message>
<xml_diff>
--- a/submission/ParkPulse_Video_Script.docx
+++ b/submission/ParkPulse_Video_Script.docx
@@ -15,7 +15,7 @@
     </w:p>
     <w:p>
       <w:r>
-        <w:t xml:space="preserve">A scene-by-scene shooting script for a ~2 minute 50 second demo. Read the </w:t>
+        <w:t xml:space="preserve">A scene-by-scene shooting script for a ~2 minute 55 second demo. Read the </w:t>
       </w:r>
       <w:r>
         <w:rPr>
@@ -95,7 +95,7 @@
         <w:pStyle w:val="ListBullet"/>
       </w:pPr>
       <w:r>
-        <w:t>Total target 2:50. If you run long, trim the forecaster and triage lines first.</w:t>
+        <w:t>Total target 2:55. If you run long, trim the forecaster and triage lines first.</w:t>
       </w:r>
     </w:p>
     <w:p>
@@ -537,7 +537,12 @@
         <w:t>Screen:</w:t>
       </w:r>
       <w:r>
-        <w:t xml:space="preserve"> Scroll to the methodology cards, then back up to the hero for the final frame.</w:t>
+        <w:t xml:space="preserve"> Scroll to the methodology cards (rest a beat on the first card, which describes</w:t>
+      </w:r>
+    </w:p>
+    <w:p>
+      <w:r>
+        <w:t>the OpenStreetMap cross-check), then back up to the hero for the final frame.</w:t>
       </w:r>
     </w:p>
     <w:p>
@@ -553,17 +558,22 @@
     </w:p>
     <w:p>
       <w:r>
-        <w:t>score is a measurement. But the moment a speed feed exists, this whole system trains</w:t>
+        <w:t>score is a measurement. But we did validate it: built blind to any road map, the score</w:t>
       </w:r>
     </w:p>
     <w:p>
       <w:r>
-        <w:t>straight into it. That is ParkPulse: where, when, and at what cost to send the next</w:t>
+        <w:t>still rediscovers the city's commercial cores, the streets next to markets and transit.</w:t>
       </w:r>
     </w:p>
     <w:p>
       <w:r>
-        <w:t>patrol. Thank you."</w:t>
+        <w:t>And the moment a speed feed exists, this whole system trains straight into it. That is</w:t>
+      </w:r>
+    </w:p>
+    <w:p>
+      <w:r>
+        <w:t>ParkPulse: where, when, and at what cost to send the next patrol. Thank you."</w:t>
       </w:r>
     </w:p>
     <w:p>

</xml_diff>